<commit_message>
feat: add compliance policy pages (about-us, privacy-policy, shipping-policy, refund-policy, terms) and confirmation rewrites for Google Ads
</commit_message>
<xml_diff>
--- a/marketing/shareable-documents/UAT_Client_Testing_Guide.docx
+++ b/marketing/shareable-documents/UAT_Client_Testing_Guide.docx
@@ -1519,7 +1519,7 @@
                 <w:color w:val="C25E3B"/>
                 <w:sz w:val="19"/>
               </w:rPr>
-              <w:t>/admin</w:t>
+              <w:t>/about-us</w:t>
             </w:r>
           </w:p>
         </w:tc>
@@ -1543,7 +1543,7 @@
                 <w:color w:val="212B36"/>
                 <w:sz w:val="19"/>
               </w:rPr>
-              <w:t>Clinic Staff CRM Portal</w:t>
+              <w:t>About Us</w:t>
             </w:r>
           </w:p>
         </w:tc>
@@ -1567,6 +1567,496 @@
                 <w:color w:val="212B36"/>
                 <w:sz w:val="19"/>
               </w:rPr>
+              <w:t>Doctor credentials, clinical mission, 15+ years experience, and physical clinic details in Thane West.</w:t>
+            </w:r>
+          </w:p>
+        </w:tc>
+        <w:tc>
+          <w:tcPr>
+            <w:tcW w:type="dxa" w:w="2016"/>
+            <w:shd w:fill="F8FAF9"/>
+            <w:tcMar>
+              <w:top w:w="80" w:type="dxa"/>
+              <w:bottom w:w="80" w:type="dxa"/>
+              <w:left w:w="100" w:type="dxa"/>
+              <w:right w:w="100" w:type="dxa"/>
+            </w:tcMar>
+          </w:tcPr>
+          <w:p>
+            <w:r>
+              <w:rPr>
+                <w:rFonts w:ascii="Calibri" w:hAnsi="Calibri"/>
+                <w:b w:val="0"/>
+                <w:i w:val="0"/>
+                <w:color w:val="212B36"/>
+                <w:sz w:val="19"/>
+              </w:rPr>
+              <w:t>Merchant &amp; ads compliance</w:t>
+            </w:r>
+          </w:p>
+        </w:tc>
+      </w:tr>
+      <w:tr>
+        <w:tc>
+          <w:tcPr>
+            <w:tcW w:type="dxa" w:w="1872"/>
+            <w:shd w:fill="FFFFFF"/>
+            <w:tcMar>
+              <w:top w:w="80" w:type="dxa"/>
+              <w:bottom w:w="80" w:type="dxa"/>
+              <w:left w:w="100" w:type="dxa"/>
+              <w:right w:w="100" w:type="dxa"/>
+            </w:tcMar>
+          </w:tcPr>
+          <w:p>
+            <w:r>
+              <w:rPr>
+                <w:rFonts w:ascii="Consolas" w:hAnsi="Consolas"/>
+                <w:b/>
+                <w:i w:val="0"/>
+                <w:color w:val="C25E3B"/>
+                <w:sz w:val="19"/>
+              </w:rPr>
+              <w:t>/privacy-policy</w:t>
+            </w:r>
+          </w:p>
+        </w:tc>
+        <w:tc>
+          <w:tcPr>
+            <w:tcW w:type="dxa" w:w="2160"/>
+            <w:shd w:fill="FFFFFF"/>
+            <w:tcMar>
+              <w:top w:w="80" w:type="dxa"/>
+              <w:bottom w:w="80" w:type="dxa"/>
+              <w:left w:w="100" w:type="dxa"/>
+              <w:right w:w="100" w:type="dxa"/>
+            </w:tcMar>
+          </w:tcPr>
+          <w:p>
+            <w:r>
+              <w:rPr>
+                <w:rFonts w:ascii="Calibri" w:hAnsi="Calibri"/>
+                <w:b w:val="0"/>
+                <w:i w:val="0"/>
+                <w:color w:val="212B36"/>
+                <w:sz w:val="19"/>
+              </w:rPr>
+              <w:t>Privacy Policy</w:t>
+            </w:r>
+          </w:p>
+        </w:tc>
+        <w:tc>
+          <w:tcPr>
+            <w:tcW w:type="dxa" w:w="3744"/>
+            <w:shd w:fill="FFFFFF"/>
+            <w:tcMar>
+              <w:top w:w="80" w:type="dxa"/>
+              <w:bottom w:w="80" w:type="dxa"/>
+              <w:left w:w="100" w:type="dxa"/>
+              <w:right w:w="100" w:type="dxa"/>
+            </w:tcMar>
+          </w:tcPr>
+          <w:p>
+            <w:r>
+              <w:rPr>
+                <w:rFonts w:ascii="Calibri" w:hAnsi="Calibri"/>
+                <w:b w:val="0"/>
+                <w:i w:val="0"/>
+                <w:color w:val="212B36"/>
+                <w:sz w:val="19"/>
+              </w:rPr>
+              <w:t>Patient data protection, medical confidentiality, and PCI-DSS payment security disclosure.</w:t>
+            </w:r>
+          </w:p>
+        </w:tc>
+        <w:tc>
+          <w:tcPr>
+            <w:tcW w:type="dxa" w:w="2016"/>
+            <w:shd w:fill="FFFFFF"/>
+            <w:tcMar>
+              <w:top w:w="80" w:type="dxa"/>
+              <w:bottom w:w="80" w:type="dxa"/>
+              <w:left w:w="100" w:type="dxa"/>
+              <w:right w:w="100" w:type="dxa"/>
+            </w:tcMar>
+          </w:tcPr>
+          <w:p>
+            <w:r>
+              <w:rPr>
+                <w:rFonts w:ascii="Calibri" w:hAnsi="Calibri"/>
+                <w:b w:val="0"/>
+                <w:i w:val="0"/>
+                <w:color w:val="212B36"/>
+                <w:sz w:val="19"/>
+              </w:rPr>
+              <w:t>Mandatory compliance (PayU/Google)</w:t>
+            </w:r>
+          </w:p>
+        </w:tc>
+      </w:tr>
+      <w:tr>
+        <w:tc>
+          <w:tcPr>
+            <w:tcW w:type="dxa" w:w="1872"/>
+            <w:shd w:fill="F8FAF9"/>
+            <w:tcMar>
+              <w:top w:w="80" w:type="dxa"/>
+              <w:bottom w:w="80" w:type="dxa"/>
+              <w:left w:w="100" w:type="dxa"/>
+              <w:right w:w="100" w:type="dxa"/>
+            </w:tcMar>
+          </w:tcPr>
+          <w:p>
+            <w:r>
+              <w:rPr>
+                <w:rFonts w:ascii="Consolas" w:hAnsi="Consolas"/>
+                <w:b/>
+                <w:i w:val="0"/>
+                <w:color w:val="C25E3B"/>
+                <w:sz w:val="19"/>
+              </w:rPr>
+              <w:t>/shipping-and-return-policy</w:t>
+            </w:r>
+          </w:p>
+        </w:tc>
+        <w:tc>
+          <w:tcPr>
+            <w:tcW w:type="dxa" w:w="2160"/>
+            <w:shd w:fill="F8FAF9"/>
+            <w:tcMar>
+              <w:top w:w="80" w:type="dxa"/>
+              <w:bottom w:w="80" w:type="dxa"/>
+              <w:left w:w="100" w:type="dxa"/>
+              <w:right w:w="100" w:type="dxa"/>
+            </w:tcMar>
+          </w:tcPr>
+          <w:p>
+            <w:r>
+              <w:rPr>
+                <w:rFonts w:ascii="Calibri" w:hAnsi="Calibri"/>
+                <w:b w:val="0"/>
+                <w:i w:val="0"/>
+                <w:color w:val="212B36"/>
+                <w:sz w:val="19"/>
+              </w:rPr>
+              <w:t>Shipping &amp; Delivery Policy</w:t>
+            </w:r>
+          </w:p>
+        </w:tc>
+        <w:tc>
+          <w:tcPr>
+            <w:tcW w:type="dxa" w:w="3744"/>
+            <w:shd w:fill="F8FAF9"/>
+            <w:tcMar>
+              <w:top w:w="80" w:type="dxa"/>
+              <w:bottom w:w="80" w:type="dxa"/>
+              <w:left w:w="100" w:type="dxa"/>
+              <w:right w:w="100" w:type="dxa"/>
+            </w:tcMar>
+          </w:tcPr>
+          <w:p>
+            <w:r>
+              <w:rPr>
+                <w:rFonts w:ascii="Calibri" w:hAnsi="Calibri"/>
+                <w:b w:val="0"/>
+                <w:i w:val="0"/>
+                <w:color w:val="212B36"/>
+                <w:sz w:val="19"/>
+              </w:rPr>
+              <w:t>In-clinic appointment fulfillment, digital masterclass room delivery, and herbal dispatch standards.</w:t>
+            </w:r>
+          </w:p>
+        </w:tc>
+        <w:tc>
+          <w:tcPr>
+            <w:tcW w:type="dxa" w:w="2016"/>
+            <w:shd w:fill="F8FAF9"/>
+            <w:tcMar>
+              <w:top w:w="80" w:type="dxa"/>
+              <w:bottom w:w="80" w:type="dxa"/>
+              <w:left w:w="100" w:type="dxa"/>
+              <w:right w:w="100" w:type="dxa"/>
+            </w:tcMar>
+          </w:tcPr>
+          <w:p>
+            <w:r>
+              <w:rPr>
+                <w:rFonts w:ascii="Calibri" w:hAnsi="Calibri"/>
+                <w:b w:val="0"/>
+                <w:i w:val="0"/>
+                <w:color w:val="212B36"/>
+                <w:sz w:val="19"/>
+              </w:rPr>
+              <w:t>Mandatory compliance for payment gateways</w:t>
+            </w:r>
+          </w:p>
+        </w:tc>
+      </w:tr>
+      <w:tr>
+        <w:tc>
+          <w:tcPr>
+            <w:tcW w:type="dxa" w:w="1872"/>
+            <w:shd w:fill="FFFFFF"/>
+            <w:tcMar>
+              <w:top w:w="80" w:type="dxa"/>
+              <w:bottom w:w="80" w:type="dxa"/>
+              <w:left w:w="100" w:type="dxa"/>
+              <w:right w:w="100" w:type="dxa"/>
+            </w:tcMar>
+          </w:tcPr>
+          <w:p>
+            <w:r>
+              <w:rPr>
+                <w:rFonts w:ascii="Consolas" w:hAnsi="Consolas"/>
+                <w:b/>
+                <w:i w:val="0"/>
+                <w:color w:val="C25E3B"/>
+                <w:sz w:val="19"/>
+              </w:rPr>
+              <w:t>/refund-policy</w:t>
+            </w:r>
+          </w:p>
+        </w:tc>
+        <w:tc>
+          <w:tcPr>
+            <w:tcW w:type="dxa" w:w="2160"/>
+            <w:shd w:fill="FFFFFF"/>
+            <w:tcMar>
+              <w:top w:w="80" w:type="dxa"/>
+              <w:bottom w:w="80" w:type="dxa"/>
+              <w:left w:w="100" w:type="dxa"/>
+              <w:right w:w="100" w:type="dxa"/>
+            </w:tcMar>
+          </w:tcPr>
+          <w:p>
+            <w:r>
+              <w:rPr>
+                <w:rFonts w:ascii="Calibri" w:hAnsi="Calibri"/>
+                <w:b w:val="0"/>
+                <w:i w:val="0"/>
+                <w:color w:val="212B36"/>
+                <w:sz w:val="19"/>
+              </w:rPr>
+              <w:t>Refund &amp; Cancellation Policy</w:t>
+            </w:r>
+          </w:p>
+        </w:tc>
+        <w:tc>
+          <w:tcPr>
+            <w:tcW w:type="dxa" w:w="3744"/>
+            <w:shd w:fill="FFFFFF"/>
+            <w:tcMar>
+              <w:top w:w="80" w:type="dxa"/>
+              <w:bottom w:w="80" w:type="dxa"/>
+              <w:left w:w="100" w:type="dxa"/>
+              <w:right w:w="100" w:type="dxa"/>
+            </w:tcMar>
+          </w:tcPr>
+          <w:p>
+            <w:r>
+              <w:rPr>
+                <w:rFonts w:ascii="Calibri" w:hAnsi="Calibri"/>
+                <w:b w:val="0"/>
+                <w:i w:val="0"/>
+                <w:color w:val="212B36"/>
+                <w:sz w:val="19"/>
+              </w:rPr>
+              <w:t>12-hour free reschedule/cancellation, 5-7 day bank refunds, and clear indication of business category.</w:t>
+            </w:r>
+          </w:p>
+        </w:tc>
+        <w:tc>
+          <w:tcPr>
+            <w:tcW w:type="dxa" w:w="2016"/>
+            <w:shd w:fill="FFFFFF"/>
+            <w:tcMar>
+              <w:top w:w="80" w:type="dxa"/>
+              <w:bottom w:w="80" w:type="dxa"/>
+              <w:left w:w="100" w:type="dxa"/>
+              <w:right w:w="100" w:type="dxa"/>
+            </w:tcMar>
+          </w:tcPr>
+          <w:p>
+            <w:r>
+              <w:rPr>
+                <w:rFonts w:ascii="Calibri" w:hAnsi="Calibri"/>
+                <w:b w:val="0"/>
+                <w:i w:val="0"/>
+                <w:color w:val="212B36"/>
+                <w:sz w:val="19"/>
+              </w:rPr>
+              <w:t>Mandatory compliance for payment gateways</w:t>
+            </w:r>
+          </w:p>
+        </w:tc>
+      </w:tr>
+      <w:tr>
+        <w:tc>
+          <w:tcPr>
+            <w:tcW w:type="dxa" w:w="1872"/>
+            <w:shd w:fill="F8FAF9"/>
+            <w:tcMar>
+              <w:top w:w="80" w:type="dxa"/>
+              <w:bottom w:w="80" w:type="dxa"/>
+              <w:left w:w="100" w:type="dxa"/>
+              <w:right w:w="100" w:type="dxa"/>
+            </w:tcMar>
+          </w:tcPr>
+          <w:p>
+            <w:r>
+              <w:rPr>
+                <w:rFonts w:ascii="Consolas" w:hAnsi="Consolas"/>
+                <w:b/>
+                <w:i w:val="0"/>
+                <w:color w:val="C25E3B"/>
+                <w:sz w:val="19"/>
+              </w:rPr>
+              <w:t>/terms-and-conditions</w:t>
+            </w:r>
+          </w:p>
+        </w:tc>
+        <w:tc>
+          <w:tcPr>
+            <w:tcW w:type="dxa" w:w="2160"/>
+            <w:shd w:fill="F8FAF9"/>
+            <w:tcMar>
+              <w:top w:w="80" w:type="dxa"/>
+              <w:bottom w:w="80" w:type="dxa"/>
+              <w:left w:w="100" w:type="dxa"/>
+              <w:right w:w="100" w:type="dxa"/>
+            </w:tcMar>
+          </w:tcPr>
+          <w:p>
+            <w:r>
+              <w:rPr>
+                <w:rFonts w:ascii="Calibri" w:hAnsi="Calibri"/>
+                <w:b w:val="0"/>
+                <w:i w:val="0"/>
+                <w:color w:val="212B36"/>
+                <w:sz w:val="19"/>
+              </w:rPr>
+              <w:t>Terms &amp; Conditions</w:t>
+            </w:r>
+          </w:p>
+        </w:tc>
+        <w:tc>
+          <w:tcPr>
+            <w:tcW w:type="dxa" w:w="3744"/>
+            <w:shd w:fill="F8FAF9"/>
+            <w:tcMar>
+              <w:top w:w="80" w:type="dxa"/>
+              <w:bottom w:w="80" w:type="dxa"/>
+              <w:left w:w="100" w:type="dxa"/>
+              <w:right w:w="100" w:type="dxa"/>
+            </w:tcMar>
+          </w:tcPr>
+          <w:p>
+            <w:r>
+              <w:rPr>
+                <w:rFonts w:ascii="Calibri" w:hAnsi="Calibri"/>
+                <w:b w:val="0"/>
+                <w:i w:val="0"/>
+                <w:color w:val="212B36"/>
+                <w:sz w:val="19"/>
+              </w:rPr>
+              <w:t>Clinical conditions of care, medical disclaimer, and governing jurisdiction.</w:t>
+            </w:r>
+          </w:p>
+        </w:tc>
+        <w:tc>
+          <w:tcPr>
+            <w:tcW w:type="dxa" w:w="2016"/>
+            <w:shd w:fill="F8FAF9"/>
+            <w:tcMar>
+              <w:top w:w="80" w:type="dxa"/>
+              <w:bottom w:w="80" w:type="dxa"/>
+              <w:left w:w="100" w:type="dxa"/>
+              <w:right w:w="100" w:type="dxa"/>
+            </w:tcMar>
+          </w:tcPr>
+          <w:p>
+            <w:r>
+              <w:rPr>
+                <w:rFonts w:ascii="Calibri" w:hAnsi="Calibri"/>
+                <w:b w:val="0"/>
+                <w:i w:val="0"/>
+                <w:color w:val="212B36"/>
+                <w:sz w:val="19"/>
+              </w:rPr>
+              <w:t>Legal &amp; merchant compliance</w:t>
+            </w:r>
+          </w:p>
+        </w:tc>
+      </w:tr>
+      <w:tr>
+        <w:tc>
+          <w:tcPr>
+            <w:tcW w:type="dxa" w:w="1872"/>
+            <w:shd w:fill="FFFFFF"/>
+            <w:tcMar>
+              <w:top w:w="80" w:type="dxa"/>
+              <w:bottom w:w="80" w:type="dxa"/>
+              <w:left w:w="100" w:type="dxa"/>
+              <w:right w:w="100" w:type="dxa"/>
+            </w:tcMar>
+          </w:tcPr>
+          <w:p>
+            <w:r>
+              <w:rPr>
+                <w:rFonts w:ascii="Consolas" w:hAnsi="Consolas"/>
+                <w:b/>
+                <w:i w:val="0"/>
+                <w:color w:val="C25E3B"/>
+                <w:sz w:val="19"/>
+              </w:rPr>
+              <w:t>/admin</w:t>
+            </w:r>
+          </w:p>
+        </w:tc>
+        <w:tc>
+          <w:tcPr>
+            <w:tcW w:type="dxa" w:w="2160"/>
+            <w:shd w:fill="FFFFFF"/>
+            <w:tcMar>
+              <w:top w:w="80" w:type="dxa"/>
+              <w:bottom w:w="80" w:type="dxa"/>
+              <w:left w:w="100" w:type="dxa"/>
+              <w:right w:w="100" w:type="dxa"/>
+            </w:tcMar>
+          </w:tcPr>
+          <w:p>
+            <w:r>
+              <w:rPr>
+                <w:rFonts w:ascii="Calibri" w:hAnsi="Calibri"/>
+                <w:b w:val="0"/>
+                <w:i w:val="0"/>
+                <w:color w:val="212B36"/>
+                <w:sz w:val="19"/>
+              </w:rPr>
+              <w:t>Clinic Staff CRM Portal</w:t>
+            </w:r>
+          </w:p>
+        </w:tc>
+        <w:tc>
+          <w:tcPr>
+            <w:tcW w:type="dxa" w:w="3744"/>
+            <w:shd w:fill="FFFFFF"/>
+            <w:tcMar>
+              <w:top w:w="80" w:type="dxa"/>
+              <w:bottom w:w="80" w:type="dxa"/>
+              <w:left w:w="100" w:type="dxa"/>
+              <w:right w:w="100" w:type="dxa"/>
+            </w:tcMar>
+          </w:tcPr>
+          <w:p>
+            <w:r>
+              <w:rPr>
+                <w:rFonts w:ascii="Calibri" w:hAnsi="Calibri"/>
+                <w:b w:val="0"/>
+                <w:i w:val="0"/>
+                <w:color w:val="212B36"/>
+                <w:sz w:val="19"/>
+              </w:rPr>
               <w:t>Passcode-protected admin desk: View patient leads, send WhatsApp messages, edit settings.</w:t>
             </w:r>
           </w:p>
@@ -1574,7 +2064,7 @@
         <w:tc>
           <w:tcPr>
             <w:tcW w:type="dxa" w:w="2016"/>
-            <w:shd w:fill="F8FAF9"/>
+            <w:shd w:fill="FFFFFF"/>
             <w:tcMar>
               <w:top w:w="80" w:type="dxa"/>
               <w:bottom w:w="80" w:type="dxa"/>

</xml_diff>